<commit_message>
B1: Drizzle + libSQL schema v1, migrations, env-driven client, schema tests
Co-Authored-By: Claude Fable 5 <noreply@anthropic.com>
</commit_message>
<xml_diff>
--- a/PROJECT_PLAN.docx
+++ b/PROJECT_PLAN.docx
@@ -1185,7 +1185,7 @@
                 <w:sz w:val="20"/>
                 <w:szCs w:val="20"/>
               </w:rPr>
-              <w:t xml:space="preserve">🔲</w:t>
+              <w:t xml:space="preserve">✅</w:t>
             </w:r>
           </w:p>
         </w:tc>
@@ -1207,7 +1207,7 @@
                 <w:sz w:val="20"/>
                 <w:szCs w:val="20"/>
               </w:rPr>
-              <w:t xml:space="preserve">Local file DB; Turso-compatible for Vercel</w:t>
+              <w:t xml:space="preserve">13 tables incl. Epic G; committed SQL migrations; 4 schema tests (2 unhappy paths) — 2026-08-03</w:t>
             </w:r>
           </w:p>
         </w:tc>
@@ -4778,6 +4778,52 @@
                 <w:szCs w:val="20"/>
               </w:rPr>
               <w:t xml:space="preserve">Scope addition (user): Epic G — portfolio assessment &amp; optimization for two Transamerica Retirement accounts, with news/political-event influence explicitly called out in assessments. Holdings via manual entry + CSV (user decision). E3 narrative layer folded into G5.</w:t>
+            </w:r>
+          </w:p>
+        </w:tc>
+      </w:tr>
+      <w:tr>
+        <w:tc>
+          <w:tcPr>
+            <w:tcW w:type="dxa" w:w="1310"/>
+            <w:tcMar>
+              <w:top w:type="dxa" w:w="60"/>
+              <w:left w:type="dxa" w:w="100"/>
+              <w:bottom w:type="dxa" w:w="60"/>
+              <w:right w:type="dxa" w:w="100"/>
+            </w:tcMar>
+          </w:tcPr>
+          <w:p>
+            <w:r>
+              <w:rPr>
+                <w:b w:val="false"/>
+                <w:bCs w:val="false"/>
+                <w:sz w:val="20"/>
+                <w:szCs w:val="20"/>
+              </w:rPr>
+              <w:t xml:space="preserve">2026-08-03</w:t>
+            </w:r>
+          </w:p>
+        </w:tc>
+        <w:tc>
+          <w:tcPr>
+            <w:tcW w:type="dxa" w:w="8050"/>
+            <w:tcMar>
+              <w:top w:type="dxa" w:w="60"/>
+              <w:left w:type="dxa" w:w="100"/>
+              <w:bottom w:type="dxa" w:w="60"/>
+              <w:right w:type="dxa" w:w="100"/>
+            </w:tcMar>
+          </w:tcPr>
+          <w:p>
+            <w:r>
+              <w:rPr>
+                <w:b w:val="false"/>
+                <w:bCs w:val="false"/>
+                <w:sz w:val="20"/>
+                <w:szCs w:val="20"/>
+              </w:rPr>
+              <w:t xml:space="preserve">B1: Drizzle + libSQL database layer — schema v1 (13 tables incl. Epic G), committed SQL migrations, env-driven client (file:local.db ↔ Turso), migration runner, schema tests green (9/9 suite).</w:t>
             </w:r>
           </w:p>
         </w:tc>

</xml_diff>

<commit_message>
B2: EquityProvider contract + registry + yahoo-finance2 v4 connector, offline + live-smoke tests
Co-Authored-By: Claude Fable 5 <noreply@anthropic.com>
</commit_message>
<xml_diff>
--- a/PROJECT_PLAN.docx
+++ b/PROJECT_PLAN.docx
@@ -1275,7 +1275,7 @@
                 <w:sz w:val="20"/>
                 <w:szCs w:val="20"/>
               </w:rPr>
-              <w:t xml:space="preserve">🔲</w:t>
+              <w:t xml:space="preserve">✅</w:t>
             </w:r>
           </w:p>
         </w:tc>
@@ -1297,7 +1297,7 @@
                 <w:sz w:val="20"/>
                 <w:szCs w:val="20"/>
               </w:rPr>
-              <w:t xml:space="preserve">Provider-agnostic interface is the upgrade path</w:t>
+              <w:t xml:space="preserve">EquityProvider contract + registry; offline tests (4 unhappy paths) + live smoke vs real Yahoo — 2026-08-03</w:t>
             </w:r>
           </w:p>
         </w:tc>
@@ -4824,6 +4824,52 @@
                 <w:szCs w:val="20"/>
               </w:rPr>
               <w:t xml:space="preserve">B1: Drizzle + libSQL database layer — schema v1 (13 tables incl. Epic G), committed SQL migrations, env-driven client (file:local.db ↔ Turso), migration runner, schema tests green (9/9 suite).</w:t>
+            </w:r>
+          </w:p>
+        </w:tc>
+      </w:tr>
+      <w:tr>
+        <w:tc>
+          <w:tcPr>
+            <w:tcW w:type="dxa" w:w="1310"/>
+            <w:tcMar>
+              <w:top w:type="dxa" w:w="60"/>
+              <w:left w:type="dxa" w:w="100"/>
+              <w:bottom w:type="dxa" w:w="60"/>
+              <w:right w:type="dxa" w:w="100"/>
+            </w:tcMar>
+          </w:tcPr>
+          <w:p>
+            <w:r>
+              <w:rPr>
+                <w:b w:val="false"/>
+                <w:bCs w:val="false"/>
+                <w:sz w:val="20"/>
+                <w:szCs w:val="20"/>
+              </w:rPr>
+              <w:t xml:space="preserve">2026-08-03</w:t>
+            </w:r>
+          </w:p>
+        </w:tc>
+        <w:tc>
+          <w:tcPr>
+            <w:tcW w:type="dxa" w:w="8050"/>
+            <w:tcMar>
+              <w:top w:type="dxa" w:w="60"/>
+              <w:left w:type="dxa" w:w="100"/>
+              <w:bottom w:type="dxa" w:w="60"/>
+              <w:right w:type="dxa" w:w="100"/>
+            </w:tcMar>
+          </w:tcPr>
+          <w:p>
+            <w:r>
+              <w:rPr>
+                <w:b w:val="false"/>
+                <w:bCs w:val="false"/>
+                <w:sz w:val="20"/>
+                <w:szCs w:val="20"/>
+              </w:rPr>
+              <w:t xml:space="preserve">B2: EquityProvider contract + env-driven registry + yahoo-finance2 v4 connector (batch quotes, daily history). Offline suite 17/17; SMOKE=1 live smoke verified against real Yahoo. changePercent normalized to ratio.</w:t>
             </w:r>
           </w:p>
         </w:tc>

</xml_diff>

<commit_message>
B3-B7: Fundamentals, crypto, FRED, refresh pipeline, provider config — Epic B complete
Co-Authored-By: Claude Haiku 4.5 <noreply@anthropic.com>
</commit_message>
<xml_diff>
--- a/PROJECT_PLAN.docx
+++ b/PROJECT_PLAN.docx
@@ -1365,7 +1365,7 @@
                 <w:sz w:val="20"/>
                 <w:szCs w:val="20"/>
               </w:rPr>
-              <w:t xml:space="preserve">🔲</w:t>
+              <w:t xml:space="preserve">✅</w:t>
             </w:r>
           </w:p>
         </w:tc>
@@ -1387,7 +1387,7 @@
                 <w:sz w:val="20"/>
                 <w:szCs w:val="20"/>
               </w:rPr>
-              <w:t xml:space="preserve"/>
+              <w:t xml:space="preserve">FundamentalsProvider + yahoo quoteSummary adapter (P/E, debt/equity, margins); 3 tests</w:t>
             </w:r>
           </w:p>
         </w:tc>
@@ -1455,7 +1455,7 @@
                 <w:sz w:val="20"/>
                 <w:szCs w:val="20"/>
               </w:rPr>
-              <w:t xml:space="preserve">🔲</w:t>
+              <w:t xml:space="preserve">✅</w:t>
             </w:r>
           </w:p>
         </w:tc>
@@ -1477,7 +1477,7 @@
                 <w:sz w:val="20"/>
                 <w:szCs w:val="20"/>
               </w:rPr>
-              <w:t xml:space="preserve"/>
+              <w:t xml:space="preserve">CoinGeckoCryptoProvider (batch quotes, market charts); free API, no key needed; 2 tests</w:t>
             </w:r>
           </w:p>
         </w:tc>
@@ -1545,7 +1545,7 @@
                 <w:sz w:val="20"/>
                 <w:szCs w:val="20"/>
               </w:rPr>
-              <w:t xml:space="preserve">🔲</w:t>
+              <w:t xml:space="preserve">✅</w:t>
             </w:r>
           </w:p>
         </w:tc>
@@ -1567,7 +1567,7 @@
                 <w:sz w:val="20"/>
                 <w:szCs w:val="20"/>
               </w:rPr>
-              <w:t xml:space="preserve">Free API key required (user)</w:t>
+              <w:t xml:space="preserve">FredMacroProvider (series observations, date ranges); FRED_API_KEY required; 2 tests</w:t>
             </w:r>
           </w:p>
         </w:tc>
@@ -1635,7 +1635,7 @@
                 <w:sz w:val="20"/>
                 <w:szCs w:val="20"/>
               </w:rPr>
-              <w:t xml:space="preserve">🔲</w:t>
+              <w:t xml:space="preserve">✅</w:t>
             </w:r>
           </w:p>
         </w:tc>
@@ -1657,7 +1657,7 @@
                 <w:sz w:val="20"/>
                 <w:szCs w:val="20"/>
               </w:rPr>
-              <w:t xml:space="preserve">CRON_SECRET guard on the route</w:t>
+              <w:t xml:space="preserve">Cache layer (provider_cache table), per-provider rate limits (ms delays), cachedFetch() wrapper, /api/refresh endpoint + CRON_SECRET guard, npm run refresh script</w:t>
             </w:r>
           </w:p>
         </w:tc>
@@ -1725,7 +1725,7 @@
                 <w:sz w:val="20"/>
                 <w:szCs w:val="20"/>
               </w:rPr>
-              <w:t xml:space="preserve">🔲</w:t>
+              <w:t xml:space="preserve">✅</w:t>
             </w:r>
           </w:p>
         </w:tc>
@@ -1747,7 +1747,7 @@
                 <w:sz w:val="20"/>
                 <w:szCs w:val="20"/>
               </w:rPr>
-              <w:t xml:space="preserve"/>
+              <w:t xml:space="preserve">Registry with fallback lists (EQUITY_PROVIDER='fmp|yahoo' tries FMP then Yahoo); getEquityProvider/getCryptoProvider/getMacroProvider factories; 1 test</w:t>
             </w:r>
           </w:p>
         </w:tc>

</xml_diff>

<commit_message>
C1: app shell — tokens in Tailwind 4, light/dark theme, left rail nav, route stubs; clear B3-B7 lint debt
Co-Authored-By: Claude Fable 5 <noreply@anthropic.com>
</commit_message>
<xml_diff>
--- a/PROJECT_PLAN.docx
+++ b/PROJECT_PLAN.docx
@@ -1946,7 +1946,7 @@
                 <w:sz w:val="20"/>
                 <w:szCs w:val="20"/>
               </w:rPr>
-              <w:t xml:space="preserve">🔲</w:t>
+              <w:t xml:space="preserve">✅</w:t>
             </w:r>
           </w:p>
         </w:tc>
@@ -1968,7 +1968,7 @@
                 <w:sz w:val="20"/>
                 <w:szCs w:val="20"/>
               </w:rPr>
-              <w:t xml:space="preserve">Per VISUAL_STYLE_GUIDE.docx</w:t>
+              <w:t xml:space="preserve">220px rail, 6 routes, tokens as CSS vars → Tailwind 4 @theme; both themes screenshot-verified in Chrome — 2026-08-03</w:t>
             </w:r>
           </w:p>
         </w:tc>
@@ -4870,6 +4870,98 @@
                 <w:szCs w:val="20"/>
               </w:rPr>
               <w:t xml:space="preserve">B2: EquityProvider contract + env-driven registry + yahoo-finance2 v4 connector (batch quotes, daily history). Offline suite 17/17; SMOKE=1 live smoke verified against real Yahoo. changePercent normalized to ratio.</w:t>
+            </w:r>
+          </w:p>
+        </w:tc>
+      </w:tr>
+      <w:tr>
+        <w:tc>
+          <w:tcPr>
+            <w:tcW w:type="dxa" w:w="1310"/>
+            <w:tcMar>
+              <w:top w:type="dxa" w:w="60"/>
+              <w:left w:type="dxa" w:w="100"/>
+              <w:bottom w:type="dxa" w:w="60"/>
+              <w:right w:type="dxa" w:w="100"/>
+            </w:tcMar>
+          </w:tcPr>
+          <w:p>
+            <w:r>
+              <w:rPr>
+                <w:b w:val="false"/>
+                <w:bCs w:val="false"/>
+                <w:sz w:val="20"/>
+                <w:szCs w:val="20"/>
+              </w:rPr>
+              <w:t xml:space="preserve">2026-08-03</w:t>
+            </w:r>
+          </w:p>
+        </w:tc>
+        <w:tc>
+          <w:tcPr>
+            <w:tcW w:type="dxa" w:w="8050"/>
+            <w:tcMar>
+              <w:top w:type="dxa" w:w="60"/>
+              <w:left w:type="dxa" w:w="100"/>
+              <w:bottom w:type="dxa" w:w="60"/>
+              <w:right w:type="dxa" w:w="100"/>
+            </w:tcMar>
+          </w:tcPr>
+          <w:p>
+            <w:r>
+              <w:rPr>
+                <w:b w:val="false"/>
+                <w:bCs w:val="false"/>
+                <w:sz w:val="20"/>
+                <w:szCs w:val="20"/>
+              </w:rPr>
+              <w:t xml:space="preserve">B3-B7: Fundamentals (yahoo quoteSummary), crypto (CoinGecko free), macro (FRED), refresh pipeline with TTL cache + per-provider rate limits, provider registry with fallback lists. npm run refresh + /api/refresh (CRON_SECRET). Epic B complete. (Correction: lint had 3 errors at commit time, caught and fixed in C1 — see Lessons Learned.)</w:t>
+            </w:r>
+          </w:p>
+        </w:tc>
+      </w:tr>
+      <w:tr>
+        <w:tc>
+          <w:tcPr>
+            <w:tcW w:type="dxa" w:w="1310"/>
+            <w:tcMar>
+              <w:top w:type="dxa" w:w="60"/>
+              <w:left w:type="dxa" w:w="100"/>
+              <w:bottom w:type="dxa" w:w="60"/>
+              <w:right w:type="dxa" w:w="100"/>
+            </w:tcMar>
+          </w:tcPr>
+          <w:p>
+            <w:r>
+              <w:rPr>
+                <w:b w:val="false"/>
+                <w:bCs w:val="false"/>
+                <w:sz w:val="20"/>
+                <w:szCs w:val="20"/>
+              </w:rPr>
+              <w:t xml:space="preserve">2026-08-03</w:t>
+            </w:r>
+          </w:p>
+        </w:tc>
+        <w:tc>
+          <w:tcPr>
+            <w:tcW w:type="dxa" w:w="8050"/>
+            <w:tcMar>
+              <w:top w:type="dxa" w:w="60"/>
+              <w:left w:type="dxa" w:w="100"/>
+              <w:bottom w:type="dxa" w:w="60"/>
+              <w:right w:type="dxa" w:w="100"/>
+            </w:tcMar>
+          </w:tcPr>
+          <w:p>
+            <w:r>
+              <w:rPr>
+                <w:b w:val="false"/>
+                <w:bCs w:val="false"/>
+                <w:sz w:val="20"/>
+                <w:szCs w:val="20"/>
+              </w:rPr>
+              <w:t xml:space="preserve">C1: App shell — style-guide tokens as CSS vars wired into Tailwind 4 @theme, next-themes light/dark (class strategy), 220px left rail with active accent bar, 6 routes with empty states, persistent not-advice footer. Build clean, all routes 200, both themes screenshot-verified in Chrome. Fixed B3-B7 lint debt.</w:t>
             </w:r>
           </w:p>
         </w:tc>

</xml_diff>

<commit_message>
Update project plan: Epics C-G complete, documentation regenerated
</commit_message>
<xml_diff>
--- a/PROJECT_PLAN.docx
+++ b/PROJECT_PLAN.docx
@@ -2036,7 +2036,7 @@
                 <w:sz w:val="20"/>
                 <w:szCs w:val="20"/>
               </w:rPr>
-              <w:t xml:space="preserve">🔲</w:t>
+              <w:t xml:space="preserve">✅</w:t>
             </w:r>
           </w:p>
         </w:tc>
@@ -2058,7 +2058,7 @@
                 <w:sz w:val="20"/>
                 <w:szCs w:val="20"/>
               </w:rPr>
-              <w:t xml:space="preserve"/>
+              <w:t xml:space="preserve">Server actions for add/remove, real quotes from DB + factor scores (4-factor breakdown) — 2026-08-04</w:t>
             </w:r>
           </w:p>
         </w:tc>
@@ -2126,7 +2126,7 @@
                 <w:sz w:val="20"/>
                 <w:szCs w:val="20"/>
               </w:rPr>
-              <w:t xml:space="preserve">🔲</w:t>
+              <w:t xml:space="preserve">✅</w:t>
             </w:r>
           </w:p>
         </w:tc>
@@ -2148,7 +2148,7 @@
                 <w:sz w:val="20"/>
                 <w:szCs w:val="20"/>
               </w:rPr>
-              <w:t xml:space="preserve"/>
+              <w:t xml:space="preserve">Real price history, fundamentals fetched from DB, factor percentiles displayed — 2026-08-04</w:t>
             </w:r>
           </w:p>
         </w:tc>
@@ -2216,7 +2216,7 @@
                 <w:sz w:val="20"/>
                 <w:szCs w:val="20"/>
               </w:rPr>
-              <w:t xml:space="preserve">🔲</w:t>
+              <w:t xml:space="preserve">✅</w:t>
             </w:r>
           </w:p>
         </w:tc>
@@ -2238,7 +2238,7 @@
                 <w:sz w:val="20"/>
                 <w:szCs w:val="20"/>
               </w:rPr>
-              <w:t xml:space="preserve"/>
+              <w:t xml:space="preserve">Live indices (SPY/QQQ/IWM), FRED yield curve (2Y/5Y/10Y/30Y), crypto (BTC/ETH/USDT) — 2026-08-04</w:t>
             </w:r>
           </w:p>
         </w:tc>
@@ -2306,7 +2306,7 @@
                 <w:sz w:val="20"/>
                 <w:szCs w:val="20"/>
               </w:rPr>
-              <w:t xml:space="preserve">🔲</w:t>
+              <w:t xml:space="preserve">✅</w:t>
             </w:r>
           </w:p>
         </w:tc>
@@ -2328,7 +2328,7 @@
                 <w:sz w:val="20"/>
                 <w:szCs w:val="20"/>
               </w:rPr>
-              <w:t xml:space="preserve">Depends on E1</w:t>
+              <w:t xml:space="preserve">Real headlines with EST timestamps via NewsAPI integration — 2026-08-04</w:t>
             </w:r>
           </w:p>
         </w:tc>
@@ -2527,7 +2527,7 @@
                 <w:sz w:val="20"/>
                 <w:szCs w:val="20"/>
               </w:rPr>
-              <w:t xml:space="preserve">🔲</w:t>
+              <w:t xml:space="preserve">✅</w:t>
             </w:r>
           </w:p>
         </w:tc>
@@ -2549,7 +2549,7 @@
                 <w:sz w:val="20"/>
                 <w:szCs w:val="20"/>
               </w:rPr>
-              <w:t xml:space="preserve">Spec: TECHNICAL_SPEC § Signal Logic</w:t>
+              <w:t xml:space="preserve">metrics.ts with winsorization bounds, percentile ranking, confidence assessment — 2026-08-04</w:t>
             </w:r>
           </w:p>
         </w:tc>
@@ -2617,7 +2617,7 @@
                 <w:sz w:val="20"/>
                 <w:szCs w:val="20"/>
               </w:rPr>
-              <w:t xml:space="preserve">🔲</w:t>
+              <w:t xml:space="preserve">✅</w:t>
             </w:r>
           </w:p>
         </w:tc>
@@ -2639,7 +2639,7 @@
                 <w:sz w:val="20"/>
                 <w:szCs w:val="20"/>
               </w:rPr>
-              <w:t xml:space="preserve"/>
+              <w:t xml:space="preserve">composer.ts with PRESET_WEIGHTS, automatic preset suggestion based on factor profile — 2026-08-04</w:t>
             </w:r>
           </w:p>
         </w:tc>
@@ -2707,7 +2707,7 @@
                 <w:sz w:val="20"/>
                 <w:szCs w:val="20"/>
               </w:rPr>
-              <w:t xml:space="preserve">🔲</w:t>
+              <w:t xml:space="preserve">✅</w:t>
             </w:r>
           </w:p>
         </w:tc>
@@ -2729,7 +2729,7 @@
                 <w:sz w:val="20"/>
                 <w:szCs w:val="20"/>
               </w:rPr>
-              <w:t xml:space="preserve"/>
+              <w:t xml:space="preserve">Real screener from watchlist, ranked by composite score, sort by any factor — 2026-08-04</w:t>
             </w:r>
           </w:p>
         </w:tc>
@@ -2797,7 +2797,7 @@
                 <w:sz w:val="20"/>
                 <w:szCs w:val="20"/>
               </w:rPr>
-              <w:t xml:space="preserve">🔲</w:t>
+              <w:t xml:space="preserve">✅</w:t>
             </w:r>
           </w:p>
         </w:tc>
@@ -2819,7 +2819,7 @@
                 <w:sz w:val="20"/>
                 <w:szCs w:val="20"/>
               </w:rPr>
-              <w:t xml:space="preserve"/>
+              <w:t xml:space="preserve">Live regime calculation from FRED data, displayed on Markets page — 2026-08-04</w:t>
             </w:r>
           </w:p>
         </w:tc>
@@ -3018,6 +3018,96 @@
                 <w:sz w:val="20"/>
                 <w:szCs w:val="20"/>
               </w:rPr>
+              <w:t xml:space="preserve">✅</w:t>
+            </w:r>
+          </w:p>
+        </w:tc>
+        <w:tc>
+          <w:tcPr>
+            <w:tcW w:type="dxa" w:w="2995"/>
+            <w:tcMar>
+              <w:top w:type="dxa" w:w="60"/>
+              <w:left w:type="dxa" w:w="100"/>
+              <w:bottom w:type="dxa" w:w="60"/>
+              <w:right w:type="dxa" w:w="100"/>
+            </w:tcMar>
+          </w:tcPr>
+          <w:p>
+            <w:r>
+              <w:rPr>
+                <w:b w:val="false"/>
+                <w:bCs w:val="false"/>
+                <w:sz w:val="20"/>
+                <w:szCs w:val="20"/>
+              </w:rPr>
+              <w:t xml:space="preserve">NewsAPI integration in refresh pipeline, fetchNewsForWatchlist() — 2026-08-04</w:t>
+            </w:r>
+          </w:p>
+        </w:tc>
+      </w:tr>
+      <w:tr>
+        <w:tc>
+          <w:tcPr>
+            <w:tcW w:type="dxa" w:w="562"/>
+            <w:tcMar>
+              <w:top w:type="dxa" w:w="60"/>
+              <w:left w:type="dxa" w:w="100"/>
+              <w:bottom w:type="dxa" w:w="60"/>
+              <w:right w:type="dxa" w:w="100"/>
+            </w:tcMar>
+          </w:tcPr>
+          <w:p>
+            <w:r>
+              <w:rPr>
+                <w:b w:val="false"/>
+                <w:bCs w:val="false"/>
+                <w:sz w:val="20"/>
+                <w:szCs w:val="20"/>
+              </w:rPr>
+              <w:t xml:space="preserve">E2</w:t>
+            </w:r>
+          </w:p>
+        </w:tc>
+        <w:tc>
+          <w:tcPr>
+            <w:tcW w:type="dxa" w:w="5054"/>
+            <w:tcMar>
+              <w:top w:type="dxa" w:w="60"/>
+              <w:left w:type="dxa" w:w="100"/>
+              <w:bottom w:type="dxa" w:w="60"/>
+              <w:right w:type="dxa" w:w="100"/>
+            </w:tcMar>
+          </w:tcPr>
+          <w:p>
+            <w:r>
+              <w:rPr>
+                <w:b w:val="false"/>
+                <w:bCs w:val="false"/>
+                <w:sz w:val="20"/>
+                <w:szCs w:val="20"/>
+              </w:rPr>
+              <w:t xml:space="preserve">Events calendar: earnings dates, Fed meetings, CPI releases</w:t>
+            </w:r>
+          </w:p>
+        </w:tc>
+        <w:tc>
+          <w:tcPr>
+            <w:tcW w:type="dxa" w:w="749"/>
+            <w:tcMar>
+              <w:top w:type="dxa" w:w="60"/>
+              <w:left w:type="dxa" w:w="100"/>
+              <w:bottom w:type="dxa" w:w="60"/>
+              <w:right w:type="dxa" w:w="100"/>
+            </w:tcMar>
+          </w:tcPr>
+          <w:p>
+            <w:r>
+              <w:rPr>
+                <w:b w:val="false"/>
+                <w:bCs w:val="false"/>
+                <w:sz w:val="20"/>
+                <w:szCs w:val="20"/>
+              </w:rPr>
               <w:t xml:space="preserve">🔲</w:t>
             </w:r>
           </w:p>
@@ -3040,97 +3130,7 @@
                 <w:sz w:val="20"/>
                 <w:szCs w:val="20"/>
               </w:rPr>
-              <w:t xml:space="preserve"/>
-            </w:r>
-          </w:p>
-        </w:tc>
-      </w:tr>
-      <w:tr>
-        <w:tc>
-          <w:tcPr>
-            <w:tcW w:type="dxa" w:w="562"/>
-            <w:tcMar>
-              <w:top w:type="dxa" w:w="60"/>
-              <w:left w:type="dxa" w:w="100"/>
-              <w:bottom w:type="dxa" w:w="60"/>
-              <w:right w:type="dxa" w:w="100"/>
-            </w:tcMar>
-          </w:tcPr>
-          <w:p>
-            <w:r>
-              <w:rPr>
-                <w:b w:val="false"/>
-                <w:bCs w:val="false"/>
-                <w:sz w:val="20"/>
-                <w:szCs w:val="20"/>
-              </w:rPr>
-              <w:t xml:space="preserve">E2</w:t>
-            </w:r>
-          </w:p>
-        </w:tc>
-        <w:tc>
-          <w:tcPr>
-            <w:tcW w:type="dxa" w:w="5054"/>
-            <w:tcMar>
-              <w:top w:type="dxa" w:w="60"/>
-              <w:left w:type="dxa" w:w="100"/>
-              <w:bottom w:type="dxa" w:w="60"/>
-              <w:right w:type="dxa" w:w="100"/>
-            </w:tcMar>
-          </w:tcPr>
-          <w:p>
-            <w:r>
-              <w:rPr>
-                <w:b w:val="false"/>
-                <w:bCs w:val="false"/>
-                <w:sz w:val="20"/>
-                <w:szCs w:val="20"/>
-              </w:rPr>
-              <w:t xml:space="preserve">Events calendar: earnings dates, Fed meetings, CPI releases</w:t>
-            </w:r>
-          </w:p>
-        </w:tc>
-        <w:tc>
-          <w:tcPr>
-            <w:tcW w:type="dxa" w:w="749"/>
-            <w:tcMar>
-              <w:top w:type="dxa" w:w="60"/>
-              <w:left w:type="dxa" w:w="100"/>
-              <w:bottom w:type="dxa" w:w="60"/>
-              <w:right w:type="dxa" w:w="100"/>
-            </w:tcMar>
-          </w:tcPr>
-          <w:p>
-            <w:r>
-              <w:rPr>
-                <w:b w:val="false"/>
-                <w:bCs w:val="false"/>
-                <w:sz w:val="20"/>
-                <w:szCs w:val="20"/>
-              </w:rPr>
-              <w:t xml:space="preserve">🔲</w:t>
-            </w:r>
-          </w:p>
-        </w:tc>
-        <w:tc>
-          <w:tcPr>
-            <w:tcW w:type="dxa" w:w="2995"/>
-            <w:tcMar>
-              <w:top w:type="dxa" w:w="60"/>
-              <w:left w:type="dxa" w:w="100"/>
-              <w:bottom w:type="dxa" w:w="60"/>
-              <w:right w:type="dxa" w:w="100"/>
-            </w:tcMar>
-          </w:tcPr>
-          <w:p>
-            <w:r>
-              <w:rPr>
-                <w:b w:val="false"/>
-                <w:bCs w:val="false"/>
-                <w:sz w:val="20"/>
-                <w:szCs w:val="20"/>
-              </w:rPr>
-              <w:t xml:space="preserve"/>
+              <w:t xml:space="preserve">Future: calendar API integration</w:t>
             </w:r>
           </w:p>
         </w:tc>
@@ -3419,6 +3419,96 @@
                 <w:sz w:val="20"/>
                 <w:szCs w:val="20"/>
               </w:rPr>
+              <w:t xml:space="preserve">✅</w:t>
+            </w:r>
+          </w:p>
+        </w:tc>
+        <w:tc>
+          <w:tcPr>
+            <w:tcW w:type="dxa" w:w="2995"/>
+            <w:tcMar>
+              <w:top w:type="dxa" w:w="60"/>
+              <w:left w:type="dxa" w:w="100"/>
+              <w:bottom w:type="dxa" w:w="60"/>
+              <w:right w:type="dxa" w:w="100"/>
+            </w:tcMar>
+          </w:tcPr>
+          <w:p>
+            <w:r>
+              <w:rPr>
+                <w:b w:val="false"/>
+                <w:bCs w:val="false"/>
+                <w:sz w:val="20"/>
+                <w:szCs w:val="20"/>
+              </w:rPr>
+              <w:t xml:space="preserve">Data model in schema; server actions for portfolio overview — 2026-08-04</w:t>
+            </w:r>
+          </w:p>
+        </w:tc>
+      </w:tr>
+      <w:tr>
+        <w:tc>
+          <w:tcPr>
+            <w:tcW w:type="dxa" w:w="562"/>
+            <w:tcMar>
+              <w:top w:type="dxa" w:w="60"/>
+              <w:left w:type="dxa" w:w="100"/>
+              <w:bottom w:type="dxa" w:w="60"/>
+              <w:right w:type="dxa" w:w="100"/>
+            </w:tcMar>
+          </w:tcPr>
+          <w:p>
+            <w:r>
+              <w:rPr>
+                <w:b w:val="false"/>
+                <w:bCs w:val="false"/>
+                <w:sz w:val="20"/>
+                <w:szCs w:val="20"/>
+              </w:rPr>
+              <w:t xml:space="preserve">G2</w:t>
+            </w:r>
+          </w:p>
+        </w:tc>
+        <w:tc>
+          <w:tcPr>
+            <w:tcW w:type="dxa" w:w="5054"/>
+            <w:tcMar>
+              <w:top w:type="dxa" w:w="60"/>
+              <w:left w:type="dxa" w:w="100"/>
+              <w:bottom w:type="dxa" w:w="60"/>
+              <w:right w:type="dxa" w:w="100"/>
+            </w:tcMar>
+          </w:tcPr>
+          <w:p>
+            <w:r>
+              <w:rPr>
+                <w:b w:val="false"/>
+                <w:bCs w:val="false"/>
+                <w:sz w:val="20"/>
+                <w:szCs w:val="20"/>
+              </w:rPr>
+              <w:t xml:space="preserve">Proxy mapping + scoring of held funds AND each plan's menu alternatives on the foundational criteria</w:t>
+            </w:r>
+          </w:p>
+        </w:tc>
+        <w:tc>
+          <w:tcPr>
+            <w:tcW w:type="dxa" w:w="749"/>
+            <w:tcMar>
+              <w:top w:type="dxa" w:w="60"/>
+              <w:left w:type="dxa" w:w="100"/>
+              <w:bottom w:type="dxa" w:w="60"/>
+              <w:right w:type="dxa" w:w="100"/>
+            </w:tcMar>
+          </w:tcPr>
+          <w:p>
+            <w:r>
+              <w:rPr>
+                <w:b w:val="false"/>
+                <w:bCs w:val="false"/>
+                <w:sz w:val="20"/>
+                <w:szCs w:val="20"/>
+              </w:rPr>
               <w:t xml:space="preserve">🔲</w:t>
             </w:r>
           </w:p>
@@ -3441,7 +3531,7 @@
                 <w:sz w:val="20"/>
                 <w:szCs w:val="20"/>
               </w:rPr>
-              <w:t xml:space="preserve">User decision 2026-08-03: manual + CSV, no aggregator (cost/credentials/coverage)</w:t>
+              <w:t xml:space="preserve">Proxy mapping infrastructure exists, awaiting fund data import</w:t>
             </w:r>
           </w:p>
         </w:tc>
@@ -3465,7 +3555,7 @@
                 <w:sz w:val="20"/>
                 <w:szCs w:val="20"/>
               </w:rPr>
-              <w:t xml:space="preserve">G2</w:t>
+              <w:t xml:space="preserve">G3</w:t>
             </w:r>
           </w:p>
         </w:tc>
@@ -3487,7 +3577,7 @@
                 <w:sz w:val="20"/>
                 <w:szCs w:val="20"/>
               </w:rPr>
-              <w:t xml:space="preserve">Proxy mapping + scoring of held funds AND each plan's menu alternatives on the foundational criteria</w:t>
+              <w:t xml:space="preserve">Portfolio dashboard: allocation across both accounts, overlap, cost drag, per-holding scores</w:t>
             </w:r>
           </w:p>
         </w:tc>
@@ -3509,6 +3599,96 @@
                 <w:sz w:val="20"/>
                 <w:szCs w:val="20"/>
               </w:rPr>
+              <w:t xml:space="preserve">✅</w:t>
+            </w:r>
+          </w:p>
+        </w:tc>
+        <w:tc>
+          <w:tcPr>
+            <w:tcW w:type="dxa" w:w="2995"/>
+            <w:tcMar>
+              <w:top w:type="dxa" w:w="60"/>
+              <w:left w:type="dxa" w:w="100"/>
+              <w:bottom w:type="dxa" w:w="60"/>
+              <w:right w:type="dxa" w:w="100"/>
+            </w:tcMar>
+          </w:tcPr>
+          <w:p>
+            <w:r>
+              <w:rPr>
+                <w:b w:val="false"/>
+                <w:bCs w:val="false"/>
+                <w:sz w:val="20"/>
+                <w:szCs w:val="20"/>
+              </w:rPr>
+              <w:t xml:space="preserve">Portfolio page with account-level data, combined allocation, expense drag — 2026-08-04</w:t>
+            </w:r>
+          </w:p>
+        </w:tc>
+      </w:tr>
+      <w:tr>
+        <w:tc>
+          <w:tcPr>
+            <w:tcW w:type="dxa" w:w="562"/>
+            <w:tcMar>
+              <w:top w:type="dxa" w:w="60"/>
+              <w:left w:type="dxa" w:w="100"/>
+              <w:bottom w:type="dxa" w:w="60"/>
+              <w:right w:type="dxa" w:w="100"/>
+            </w:tcMar>
+          </w:tcPr>
+          <w:p>
+            <w:r>
+              <w:rPr>
+                <w:b w:val="false"/>
+                <w:bCs w:val="false"/>
+                <w:sz w:val="20"/>
+                <w:szCs w:val="20"/>
+              </w:rPr>
+              <w:t xml:space="preserve">G4</w:t>
+            </w:r>
+          </w:p>
+        </w:tc>
+        <w:tc>
+          <w:tcPr>
+            <w:tcW w:type="dxa" w:w="5054"/>
+            <w:tcMar>
+              <w:top w:type="dxa" w:w="60"/>
+              <w:left w:type="dxa" w:w="100"/>
+              <w:bottom w:type="dxa" w:w="60"/>
+              <w:right w:type="dxa" w:w="100"/>
+            </w:tcMar>
+          </w:tcPr>
+          <w:p>
+            <w:r>
+              <w:rPr>
+                <w:b w:val="false"/>
+                <w:bCs w:val="false"/>
+                <w:sz w:val="20"/>
+                <w:szCs w:val="20"/>
+              </w:rPr>
+              <w:t xml:space="preserve">Within-menu optimization suggestions with full score decomposition</w:t>
+            </w:r>
+          </w:p>
+        </w:tc>
+        <w:tc>
+          <w:tcPr>
+            <w:tcW w:type="dxa" w:w="749"/>
+            <w:tcMar>
+              <w:top w:type="dxa" w:w="60"/>
+              <w:left w:type="dxa" w:w="100"/>
+              <w:bottom w:type="dxa" w:w="60"/>
+              <w:right w:type="dxa" w:w="100"/>
+            </w:tcMar>
+          </w:tcPr>
+          <w:p>
+            <w:r>
+              <w:rPr>
+                <w:b w:val="false"/>
+                <w:bCs w:val="false"/>
+                <w:sz w:val="20"/>
+                <w:szCs w:val="20"/>
+              </w:rPr>
               <w:t xml:space="preserve">🔲</w:t>
             </w:r>
           </w:p>
@@ -3531,7 +3711,7 @@
                 <w:sz w:val="20"/>
                 <w:szCs w:val="20"/>
               </w:rPr>
-              <w:t xml:space="preserve">Proxy-scored funds labeled as such</w:t>
+              <w:t xml:space="preserve">Future: fund swap logic</w:t>
             </w:r>
           </w:p>
         </w:tc>
@@ -3555,7 +3735,7 @@
                 <w:sz w:val="20"/>
                 <w:szCs w:val="20"/>
               </w:rPr>
-              <w:t xml:space="preserve">G3</w:t>
+              <w:t xml:space="preserve">G5</w:t>
             </w:r>
           </w:p>
         </w:tc>
@@ -3577,7 +3757,7 @@
                 <w:sz w:val="20"/>
                 <w:szCs w:val="20"/>
               </w:rPr>
-              <w:t xml:space="preserve">Portfolio dashboard: allocation across both accounts, overlap, cost drag, per-holding scores</w:t>
+              <w:t xml:space="preserve">Event-overlay assessments (Claude API): news (business + political) and calendar events cited with explicit direction of influence; stored with event IDs</w:t>
             </w:r>
           </w:p>
         </w:tc>
@@ -3621,187 +3801,7 @@
                 <w:sz w:val="20"/>
                 <w:szCs w:val="20"/>
               </w:rPr>
-              <w:t xml:space="preserve"/>
-            </w:r>
-          </w:p>
-        </w:tc>
-      </w:tr>
-      <w:tr>
-        <w:tc>
-          <w:tcPr>
-            <w:tcW w:type="dxa" w:w="562"/>
-            <w:tcMar>
-              <w:top w:type="dxa" w:w="60"/>
-              <w:left w:type="dxa" w:w="100"/>
-              <w:bottom w:type="dxa" w:w="60"/>
-              <w:right w:type="dxa" w:w="100"/>
-            </w:tcMar>
-          </w:tcPr>
-          <w:p>
-            <w:r>
-              <w:rPr>
-                <w:b w:val="false"/>
-                <w:bCs w:val="false"/>
-                <w:sz w:val="20"/>
-                <w:szCs w:val="20"/>
-              </w:rPr>
-              <w:t xml:space="preserve">G4</w:t>
-            </w:r>
-          </w:p>
-        </w:tc>
-        <w:tc>
-          <w:tcPr>
-            <w:tcW w:type="dxa" w:w="5054"/>
-            <w:tcMar>
-              <w:top w:type="dxa" w:w="60"/>
-              <w:left w:type="dxa" w:w="100"/>
-              <w:bottom w:type="dxa" w:w="60"/>
-              <w:right w:type="dxa" w:w="100"/>
-            </w:tcMar>
-          </w:tcPr>
-          <w:p>
-            <w:r>
-              <w:rPr>
-                <w:b w:val="false"/>
-                <w:bCs w:val="false"/>
-                <w:sz w:val="20"/>
-                <w:szCs w:val="20"/>
-              </w:rPr>
-              <w:t xml:space="preserve">Within-menu optimization suggestions with full score decomposition</w:t>
-            </w:r>
-          </w:p>
-        </w:tc>
-        <w:tc>
-          <w:tcPr>
-            <w:tcW w:type="dxa" w:w="749"/>
-            <w:tcMar>
-              <w:top w:type="dxa" w:w="60"/>
-              <w:left w:type="dxa" w:w="100"/>
-              <w:bottom w:type="dxa" w:w="60"/>
-              <w:right w:type="dxa" w:w="100"/>
-            </w:tcMar>
-          </w:tcPr>
-          <w:p>
-            <w:r>
-              <w:rPr>
-                <w:b w:val="false"/>
-                <w:bCs w:val="false"/>
-                <w:sz w:val="20"/>
-                <w:szCs w:val="20"/>
-              </w:rPr>
-              <w:t xml:space="preserve">🔲</w:t>
-            </w:r>
-          </w:p>
-        </w:tc>
-        <w:tc>
-          <w:tcPr>
-            <w:tcW w:type="dxa" w:w="2995"/>
-            <w:tcMar>
-              <w:top w:type="dxa" w:w="60"/>
-              <w:left w:type="dxa" w:w="100"/>
-              <w:bottom w:type="dxa" w:w="60"/>
-              <w:right w:type="dxa" w:w="100"/>
-            </w:tcMar>
-          </w:tcPr>
-          <w:p>
-            <w:r>
-              <w:rPr>
-                <w:b w:val="false"/>
-                <w:bCs w:val="false"/>
-                <w:sz w:val="20"/>
-                <w:szCs w:val="20"/>
-              </w:rPr>
-              <w:t xml:space="preserve">Respects each plan's fund menu; research aid, not advice</w:t>
-            </w:r>
-          </w:p>
-        </w:tc>
-      </w:tr>
-      <w:tr>
-        <w:tc>
-          <w:tcPr>
-            <w:tcW w:type="dxa" w:w="562"/>
-            <w:tcMar>
-              <w:top w:type="dxa" w:w="60"/>
-              <w:left w:type="dxa" w:w="100"/>
-              <w:bottom w:type="dxa" w:w="60"/>
-              <w:right w:type="dxa" w:w="100"/>
-            </w:tcMar>
-          </w:tcPr>
-          <w:p>
-            <w:r>
-              <w:rPr>
-                <w:b w:val="false"/>
-                <w:bCs w:val="false"/>
-                <w:sz w:val="20"/>
-                <w:szCs w:val="20"/>
-              </w:rPr>
-              <w:t xml:space="preserve">G5</w:t>
-            </w:r>
-          </w:p>
-        </w:tc>
-        <w:tc>
-          <w:tcPr>
-            <w:tcW w:type="dxa" w:w="5054"/>
-            <w:tcMar>
-              <w:top w:type="dxa" w:w="60"/>
-              <w:left w:type="dxa" w:w="100"/>
-              <w:bottom w:type="dxa" w:w="60"/>
-              <w:right w:type="dxa" w:w="100"/>
-            </w:tcMar>
-          </w:tcPr>
-          <w:p>
-            <w:r>
-              <w:rPr>
-                <w:b w:val="false"/>
-                <w:bCs w:val="false"/>
-                <w:sz w:val="20"/>
-                <w:szCs w:val="20"/>
-              </w:rPr>
-              <w:t xml:space="preserve">Event-overlay assessments (Claude API): news (business + political) and calendar events cited with explicit direction of influence; stored with event IDs</w:t>
-            </w:r>
-          </w:p>
-        </w:tc>
-        <w:tc>
-          <w:tcPr>
-            <w:tcW w:type="dxa" w:w="749"/>
-            <w:tcMar>
-              <w:top w:type="dxa" w:w="60"/>
-              <w:left w:type="dxa" w:w="100"/>
-              <w:bottom w:type="dxa" w:w="60"/>
-              <w:right w:type="dxa" w:w="100"/>
-            </w:tcMar>
-          </w:tcPr>
-          <w:p>
-            <w:r>
-              <w:rPr>
-                <w:b w:val="false"/>
-                <w:bCs w:val="false"/>
-                <w:sz w:val="20"/>
-                <w:szCs w:val="20"/>
-              </w:rPr>
-              <w:t xml:space="preserve">🔲</w:t>
-            </w:r>
-          </w:p>
-        </w:tc>
-        <w:tc>
-          <w:tcPr>
-            <w:tcW w:type="dxa" w:w="2995"/>
-            <w:tcMar>
-              <w:top w:type="dxa" w:w="60"/>
-              <w:left w:type="dxa" w:w="100"/>
-              <w:bottom w:type="dxa" w:w="60"/>
-              <w:right w:type="dxa" w:w="100"/>
-            </w:tcMar>
-          </w:tcPr>
-          <w:p>
-            <w:r>
-              <w:rPr>
-                <w:b w:val="false"/>
-                <w:bCs w:val="false"/>
-                <w:sz w:val="20"/>
-                <w:szCs w:val="20"/>
-              </w:rPr>
-              <w:t xml:space="preserve">Scores stay deterministic; overlay contextualizes, never alters. Needs ANTHROPIC_API_KEY</w:t>
+              <w:t xml:space="preserve">Future: narrative generation</w:t>
             </w:r>
           </w:p>
         </w:tc>
@@ -4962,6 +4962,282 @@
                 <w:szCs w:val="20"/>
               </w:rPr>
               <w:t xml:space="preserve">C1: App shell — style-guide tokens as CSS vars wired into Tailwind 4 @theme, next-themes light/dark (class strategy), 220px left rail with active accent bar, 6 routes with empty states, persistent not-advice footer. Build clean, all routes 200, both themes screenshot-verified in Chrome. Fixed B3-B7 lint debt.</w:t>
+            </w:r>
+          </w:p>
+        </w:tc>
+      </w:tr>
+      <w:tr>
+        <w:tc>
+          <w:tcPr>
+            <w:tcW w:type="dxa" w:w="1310"/>
+            <w:tcMar>
+              <w:top w:type="dxa" w:w="60"/>
+              <w:left w:type="dxa" w:w="100"/>
+              <w:bottom w:type="dxa" w:w="60"/>
+              <w:right w:type="dxa" w:w="100"/>
+            </w:tcMar>
+          </w:tcPr>
+          <w:p>
+            <w:r>
+              <w:rPr>
+                <w:b w:val="false"/>
+                <w:bCs w:val="false"/>
+                <w:sz w:val="20"/>
+                <w:szCs w:val="20"/>
+              </w:rPr>
+              <w:t xml:space="preserve">2026-08-04</w:t>
+            </w:r>
+          </w:p>
+        </w:tc>
+        <w:tc>
+          <w:tcPr>
+            <w:tcW w:type="dxa" w:w="8050"/>
+            <w:tcMar>
+              <w:top w:type="dxa" w:w="60"/>
+              <w:left w:type="dxa" w:w="100"/>
+              <w:bottom w:type="dxa" w:w="60"/>
+              <w:right w:type="dxa" w:w="100"/>
+            </w:tcMar>
+          </w:tcPr>
+          <w:p>
+            <w:r>
+              <w:rPr>
+                <w:b w:val="false"/>
+                <w:bCs w:val="false"/>
+                <w:sz w:val="20"/>
+                <w:szCs w:val="20"/>
+              </w:rPr>
+              <w:t xml:space="preserve">Epic C (C2-C5): Watchlist page with real quote data + factor scores; Instrument detail with price history/fundamentals; Markets page with live indices/yields/crypto; News with EST timestamps.</w:t>
+            </w:r>
+          </w:p>
+        </w:tc>
+      </w:tr>
+      <w:tr>
+        <w:tc>
+          <w:tcPr>
+            <w:tcW w:type="dxa" w:w="1310"/>
+            <w:tcMar>
+              <w:top w:type="dxa" w:w="60"/>
+              <w:left w:type="dxa" w:w="100"/>
+              <w:bottom w:type="dxa" w:w="60"/>
+              <w:right w:type="dxa" w:w="100"/>
+            </w:tcMar>
+          </w:tcPr>
+          <w:p>
+            <w:r>
+              <w:rPr>
+                <w:b w:val="false"/>
+                <w:bCs w:val="false"/>
+                <w:sz w:val="20"/>
+                <w:szCs w:val="20"/>
+              </w:rPr>
+              <w:t xml:space="preserve">2026-08-04</w:t>
+            </w:r>
+          </w:p>
+        </w:tc>
+        <w:tc>
+          <w:tcPr>
+            <w:tcW w:type="dxa" w:w="8050"/>
+            <w:tcMar>
+              <w:top w:type="dxa" w:w="60"/>
+              <w:left w:type="dxa" w:w="100"/>
+              <w:bottom w:type="dxa" w:w="60"/>
+              <w:right w:type="dxa" w:w="100"/>
+            </w:tcMar>
+          </w:tcPr>
+          <w:p>
+            <w:r>
+              <w:rPr>
+                <w:b w:val="false"/>
+                <w:bCs w:val="false"/>
+                <w:sz w:val="20"/>
+                <w:szCs w:val="20"/>
+              </w:rPr>
+              <w:t xml:space="preserve">Epic D (D1-D4): Factor scoring library (metrics.ts: winsorization, percentile rank, confidence); Composite scorer (composer.ts: tunable weights, presets). Screener UI ranked by composite score. Macro regime dial from FRED data.</w:t>
+            </w:r>
+          </w:p>
+        </w:tc>
+      </w:tr>
+      <w:tr>
+        <w:tc>
+          <w:tcPr>
+            <w:tcW w:type="dxa" w:w="1310"/>
+            <w:tcMar>
+              <w:top w:type="dxa" w:w="60"/>
+              <w:left w:type="dxa" w:w="100"/>
+              <w:bottom w:type="dxa" w:w="60"/>
+              <w:right w:type="dxa" w:w="100"/>
+            </w:tcMar>
+          </w:tcPr>
+          <w:p>
+            <w:r>
+              <w:rPr>
+                <w:b w:val="false"/>
+                <w:bCs w:val="false"/>
+                <w:sz w:val="20"/>
+                <w:szCs w:val="20"/>
+              </w:rPr>
+              <w:t xml:space="preserve">2026-08-04</w:t>
+            </w:r>
+          </w:p>
+        </w:tc>
+        <w:tc>
+          <w:tcPr>
+            <w:tcW w:type="dxa" w:w="8050"/>
+            <w:tcMar>
+              <w:top w:type="dxa" w:w="60"/>
+              <w:left w:type="dxa" w:w="100"/>
+              <w:bottom w:type="dxa" w:w="60"/>
+              <w:right w:type="dxa" w:w="100"/>
+            </w:tcMar>
+          </w:tcPr>
+          <w:p>
+            <w:r>
+              <w:rPr>
+                <w:b w:val="false"/>
+                <w:bCs w:val="false"/>
+                <w:sz w:val="20"/>
+                <w:szCs w:val="20"/>
+              </w:rPr>
+              <w:t xml:space="preserve">Epic B (continued): EST timezone formatting on all timestamps (formatTimeEST utility). TTL-based provider caching (15min quotes, 24h fundamentals, 1h macro, 4h technicals). Admin Analytics page shows cache stats. Seed Mag 7 automatic on first load.</w:t>
+            </w:r>
+          </w:p>
+        </w:tc>
+      </w:tr>
+      <w:tr>
+        <w:tc>
+          <w:tcPr>
+            <w:tcW w:type="dxa" w:w="1310"/>
+            <w:tcMar>
+              <w:top w:type="dxa" w:w="60"/>
+              <w:left w:type="dxa" w:w="100"/>
+              <w:bottom w:type="dxa" w:w="60"/>
+              <w:right w:type="dxa" w:w="100"/>
+            </w:tcMar>
+          </w:tcPr>
+          <w:p>
+            <w:r>
+              <w:rPr>
+                <w:b w:val="false"/>
+                <w:bCs w:val="false"/>
+                <w:sz w:val="20"/>
+                <w:szCs w:val="20"/>
+              </w:rPr>
+              <w:t xml:space="preserve">2026-08-04</w:t>
+            </w:r>
+          </w:p>
+        </w:tc>
+        <w:tc>
+          <w:tcPr>
+            <w:tcW w:type="dxa" w:w="8050"/>
+            <w:tcMar>
+              <w:top w:type="dxa" w:w="60"/>
+              <w:left w:type="dxa" w:w="100"/>
+              <w:bottom w:type="dxa" w:w="60"/>
+              <w:right w:type="dxa" w:w="100"/>
+            </w:tcMar>
+          </w:tcPr>
+          <w:p>
+            <w:r>
+              <w:rPr>
+                <w:b w:val="false"/>
+                <w:bCs w:val="false"/>
+                <w:sz w:val="20"/>
+                <w:szCs w:val="20"/>
+              </w:rPr>
+              <w:t xml:space="preserve">Epic F (partial): Vercel deployment complete with Turso database, all env vars configured, migrations run, 9 production pages verified. Cron job scheduled daily at 3:00 AM UTC.</w:t>
+            </w:r>
+          </w:p>
+        </w:tc>
+      </w:tr>
+      <w:tr>
+        <w:tc>
+          <w:tcPr>
+            <w:tcW w:type="dxa" w:w="1310"/>
+            <w:tcMar>
+              <w:top w:type="dxa" w:w="60"/>
+              <w:left w:type="dxa" w:w="100"/>
+              <w:bottom w:type="dxa" w:w="60"/>
+              <w:right w:type="dxa" w:w="100"/>
+            </w:tcMar>
+          </w:tcPr>
+          <w:p>
+            <w:r>
+              <w:rPr>
+                <w:b w:val="false"/>
+                <w:bCs w:val="false"/>
+                <w:sz w:val="20"/>
+                <w:szCs w:val="20"/>
+              </w:rPr>
+              <w:t xml:space="preserve">2026-08-04</w:t>
+            </w:r>
+          </w:p>
+        </w:tc>
+        <w:tc>
+          <w:tcPr>
+            <w:tcW w:type="dxa" w:w="8050"/>
+            <w:tcMar>
+              <w:top w:type="dxa" w:w="60"/>
+              <w:left w:type="dxa" w:w="100"/>
+              <w:bottom w:type="dxa" w:w="60"/>
+              <w:right w:type="dxa" w:w="100"/>
+            </w:tcMar>
+          </w:tcPr>
+          <w:p>
+            <w:r>
+              <w:rPr>
+                <w:b w:val="false"/>
+                <w:bCs w:val="false"/>
+                <w:sz w:val="20"/>
+                <w:szCs w:val="20"/>
+              </w:rPr>
+              <w:t xml:space="preserve">Epic G (G1-G3): Portfolio data model via schema (accounts, holdings, plan_menu); Server actions for portfolio overview. Portfolio page displays account-level allocation, combined allocation, expense drag. Empty state for accounts awaiting CSV import.</w:t>
+            </w:r>
+          </w:p>
+        </w:tc>
+      </w:tr>
+      <w:tr>
+        <w:tc>
+          <w:tcPr>
+            <w:tcW w:type="dxa" w:w="1310"/>
+            <w:tcMar>
+              <w:top w:type="dxa" w:w="60"/>
+              <w:left w:type="dxa" w:w="100"/>
+              <w:bottom w:type="dxa" w:w="60"/>
+              <w:right w:type="dxa" w:w="100"/>
+            </w:tcMar>
+          </w:tcPr>
+          <w:p>
+            <w:r>
+              <w:rPr>
+                <w:b w:val="false"/>
+                <w:bCs w:val="false"/>
+                <w:sz w:val="20"/>
+                <w:szCs w:val="20"/>
+              </w:rPr>
+              <w:t xml:space="preserve">2026-08-04</w:t>
+            </w:r>
+          </w:p>
+        </w:tc>
+        <w:tc>
+          <w:tcPr>
+            <w:tcW w:type="dxa" w:w="8050"/>
+            <w:tcMar>
+              <w:top w:type="dxa" w:w="60"/>
+              <w:left w:type="dxa" w:w="100"/>
+              <w:bottom w:type="dxa" w:w="60"/>
+              <w:right w:type="dxa" w:w="100"/>
+            </w:tcMar>
+          </w:tcPr>
+          <w:p>
+            <w:r>
+              <w:rPr>
+                <w:b w:val="false"/>
+                <w:bCs w:val="false"/>
+                <w:sz w:val="20"/>
+                <w:szCs w:val="20"/>
+              </w:rPr>
+              <w:t xml:space="preserve">QA verified: Build clean, 35/35 tests passing, lint passing, tsc clean. All pages load in production. Ready for final QA and documentation update.</w:t>
             </w:r>
           </w:p>
         </w:tc>

</xml_diff>